<commit_message>
up to figure 4 in plots_tables and results section
</commit_message>
<xml_diff>
--- a/papers/Figures_31Oct2025.docx
+++ b/papers/Figures_31Oct2025.docx
@@ -110,7 +110,25 @@
           <w:sz w:val="24"/>
           <w:szCs w:val="24"/>
         </w:rPr>
-        <w:t xml:space="preserve"> Vaccination then occurs after a random delay (thick green line) and v</w:t>
+        <w:t xml:space="preserve"> Vaccination then occurs after a random delay (thick green line</w:t>
+      </w:r>
+      <w:proofErr w:type="gramStart"/>
+      <w:r>
+        <w:rPr>
+          <w:rFonts w:ascii="Aptos" w:hAnsi="Aptos" w:cs="Cambria Math" w:hint="eastAsia"/>
+          <w:sz w:val="24"/>
+          <w:szCs w:val="24"/>
+        </w:rPr>
+        <w:t>)</w:t>
+      </w:r>
+      <w:proofErr w:type="gramEnd"/>
+      <w:r>
+        <w:rPr>
+          <w:rFonts w:ascii="Aptos" w:hAnsi="Aptos" w:cs="Cambria Math" w:hint="eastAsia"/>
+          <w:sz w:val="24"/>
+          <w:szCs w:val="24"/>
+        </w:rPr>
+        <w:t xml:space="preserve"> and v</w:t>
       </w:r>
       <w:r>
         <w:rPr>
@@ -624,7 +642,25 @@
           <w:sz w:val="24"/>
           <w:szCs w:val="24"/>
         </w:rPr>
-        <w:t>(C) Median epidemic curve with 95% central percentiles; inset shows the cumulative probability distribution of time to peak (in weeks).</w:t>
+        <w:t xml:space="preserve">(C) Median epidemic curve with 95% central percentiles; </w:t>
+      </w:r>
+      <w:proofErr w:type="gramStart"/>
+      <w:r>
+        <w:rPr>
+          <w:rFonts w:ascii="Aptos" w:hAnsi="Aptos" w:cs="Cambria Math"/>
+          <w:sz w:val="24"/>
+          <w:szCs w:val="24"/>
+        </w:rPr>
+        <w:t>inset</w:t>
+      </w:r>
+      <w:proofErr w:type="gramEnd"/>
+      <w:r>
+        <w:rPr>
+          <w:rFonts w:ascii="Aptos" w:hAnsi="Aptos" w:cs="Cambria Math"/>
+          <w:sz w:val="24"/>
+          <w:szCs w:val="24"/>
+        </w:rPr>
+        <w:t xml:space="preserve"> shows the cumulative probability distribution of time to peak (in weeks).</w:t>
       </w:r>
       <w:r>
         <w:rPr>
@@ -845,7 +881,23 @@
           <w:sz w:val="24"/>
           <w:szCs w:val="24"/>
         </w:rPr>
-        <w:t xml:space="preserve">ercent of cases averted </w:t>
+        <w:t>ercent</w:t>
+      </w:r>
+      <w:r>
+        <w:rPr>
+          <w:rFonts w:ascii="Aptos" w:hAnsi="Aptos" w:cs="Cambria Math" w:hint="eastAsia"/>
+          <w:sz w:val="24"/>
+          <w:szCs w:val="24"/>
+        </w:rPr>
+        <w:t>age</w:t>
+      </w:r>
+      <w:r>
+        <w:rPr>
+          <w:rFonts w:ascii="Aptos" w:hAnsi="Aptos" w:cs="Cambria Math"/>
+          <w:sz w:val="24"/>
+          <w:szCs w:val="24"/>
+        </w:rPr>
+        <w:t xml:space="preserve"> cases averted </w:t>
       </w:r>
       <w:r>
         <w:rPr>
@@ -877,15 +929,15 @@
           <w:sz w:val="24"/>
           <w:szCs w:val="24"/>
         </w:rPr>
-        <w:t xml:space="preserve"> i</w:t>
-      </w:r>
-      <w:r>
-        <w:rPr>
-          <w:rFonts w:ascii="Aptos" w:hAnsi="Aptos" w:cs="Cambria Math" w:hint="eastAsia"/>
-          <w:sz w:val="24"/>
-          <w:szCs w:val="24"/>
-        </w:rPr>
-        <w:t xml:space="preserve">nitiated </w:t>
+        <w:t xml:space="preserve"> </w:t>
+      </w:r>
+      <w:r>
+        <w:rPr>
+          <w:rFonts w:ascii="Aptos" w:hAnsi="Aptos" w:cs="Cambria Math" w:hint="eastAsia"/>
+          <w:sz w:val="24"/>
+          <w:szCs w:val="24"/>
+        </w:rPr>
+        <w:t xml:space="preserve">implemented in week </w:t>
       </w:r>
       <w:r>
         <w:rPr>
@@ -901,7 +953,23 @@
           <w:sz w:val="24"/>
           <w:szCs w:val="24"/>
         </w:rPr>
-        <w:t xml:space="preserve"> to 15 weeks</w:t>
+        <w:t xml:space="preserve"> to </w:t>
+      </w:r>
+      <w:r>
+        <w:rPr>
+          <w:rFonts w:ascii="Aptos" w:hAnsi="Aptos" w:cs="Cambria Math" w:hint="eastAsia"/>
+          <w:sz w:val="24"/>
+          <w:szCs w:val="24"/>
+        </w:rPr>
+        <w:t xml:space="preserve">week </w:t>
+      </w:r>
+      <w:r>
+        <w:rPr>
+          <w:rFonts w:ascii="Aptos" w:hAnsi="Aptos" w:cs="Cambria Math"/>
+          <w:sz w:val="24"/>
+          <w:szCs w:val="24"/>
+        </w:rPr>
+        <w:t>15</w:t>
       </w:r>
       <w:r>
         <w:rPr>
@@ -913,19 +981,19 @@
       </w:r>
       <w:r>
         <w:rPr>
-          <w:rFonts w:ascii="Aptos" w:hAnsi="Aptos" w:cs="Cambria Math" w:hint="eastAsia"/>
-          <w:sz w:val="24"/>
-          <w:szCs w:val="24"/>
-        </w:rPr>
-        <w:t xml:space="preserve">after outbreak onset </w:t>
-      </w:r>
-      <w:r>
-        <w:rPr>
-          <w:rFonts w:ascii="Aptos" w:hAnsi="Aptos" w:cs="Cambria Math"/>
-          <w:sz w:val="24"/>
-          <w:szCs w:val="24"/>
-        </w:rPr>
-        <w:t>under vaccine coverage of 60%, 75%, and 90% (ORI is triggered at outbreak onset)</w:t>
+          <w:rFonts w:ascii="Aptos" w:hAnsi="Aptos" w:cs="Cambria Math"/>
+          <w:sz w:val="24"/>
+          <w:szCs w:val="24"/>
+        </w:rPr>
+        <w:t>under vaccine coverage of 60%, 75%, and 90%</w:t>
+      </w:r>
+      <w:r>
+        <w:rPr>
+          <w:rFonts w:ascii="Aptos" w:hAnsi="Aptos" w:cs="Cambria Math" w:hint="eastAsia"/>
+          <w:sz w:val="24"/>
+          <w:szCs w:val="24"/>
+        </w:rPr>
+        <w:t>.</w:t>
       </w:r>
       <w:r>
         <w:rPr>
@@ -940,7 +1008,7 @@
         <w:t xml:space="preserve">(B) </w:t>
       </w:r>
       <w:r>
-        <w:t>Exponential-decay fits to the proportion of cases averted, normalized to the week-1 value, under 75% vaccine coverage: thin colored curves show 30 representative outbreaks; the thick red curve is the median; darker shading denotes the interquartile (50%) envelope and lighter shading the 95% envelope.</w:t>
+        <w:t>Exponential</w:t>
       </w:r>
       <w:r>
         <w:rPr>
@@ -949,6 +1017,50 @@
         <w:t xml:space="preserve"> </w:t>
       </w:r>
       <w:r>
+        <w:t xml:space="preserve">decay fits to the proportion of cases averted, normalized to the week-1 value, </w:t>
+      </w:r>
+      <m:oMath>
+        <m:acc>
+          <m:accPr>
+            <m:ctrlPr>
+              <w:rPr>
+                <w:rFonts w:ascii="Cambria Math" w:hAnsi="Cambria Math"/>
+                <w:i/>
+              </w:rPr>
+            </m:ctrlPr>
+          </m:accPr>
+          <m:e>
+            <m:r>
+              <w:rPr>
+                <w:rFonts w:ascii="Cambria Math" w:hAnsi="Cambria Math"/>
+              </w:rPr>
+              <m:t>z</m:t>
+            </m:r>
+          </m:e>
+        </m:acc>
+        <m:r>
+          <w:rPr>
+            <w:rFonts w:ascii="Cambria Math" w:hAnsi="Cambria Math"/>
+          </w:rPr>
+          <m:t>(t)</m:t>
+        </m:r>
+      </m:oMath>
+      <w:r>
+        <w:rPr>
+          <w:rFonts w:hint="eastAsia"/>
+        </w:rPr>
+        <w:t xml:space="preserve">, </w:t>
+      </w:r>
+      <w:r>
+        <w:t>under 75% vaccine coverage: thin colored curves show 30 representative outbreaks; the thick red curve is the median; darker shading denotes the interquartile (50%) envelope and lighter shading the 95% envelope.</w:t>
+      </w:r>
+      <w:r>
+        <w:rPr>
+          <w:rFonts w:hint="eastAsia"/>
+        </w:rPr>
+        <w:t xml:space="preserve"> </w:t>
+      </w:r>
+      <w:r>
         <w:rPr>
           <w:rFonts w:ascii="Aptos" w:hAnsi="Aptos" w:cs="Cambria Math" w:hint="eastAsia"/>
           <w:sz w:val="24"/>
@@ -962,7 +1074,71 @@
           <w:sz w:val="24"/>
           <w:szCs w:val="24"/>
         </w:rPr>
-        <w:t>Proportion of outbreaks eligible for analysis at each delay (i.e., outbreaks long enough for an ORI to have occurred by that delay).</w:t>
+        <w:t>Proportion of outbreaks</w:t>
+      </w:r>
+      <w:r>
+        <w:rPr>
+          <w:rFonts w:ascii="Aptos" w:hAnsi="Aptos" w:cs="Cambria Math" w:hint="eastAsia"/>
+          <w:sz w:val="24"/>
+          <w:szCs w:val="24"/>
+        </w:rPr>
+        <w:t xml:space="preserve">, </w:t>
+      </w:r>
+      <m:oMath>
+        <m:acc>
+          <m:accPr>
+            <m:ctrlPr>
+              <w:rPr>
+                <w:rFonts w:ascii="Cambria Math" w:hAnsi="Cambria Math"/>
+                <w:i/>
+              </w:rPr>
+            </m:ctrlPr>
+          </m:accPr>
+          <m:e>
+            <m:r>
+              <w:rPr>
+                <w:rFonts w:ascii="Cambria Math" w:hAnsi="Cambria Math"/>
+              </w:rPr>
+              <m:t>y</m:t>
+            </m:r>
+          </m:e>
+        </m:acc>
+        <m:r>
+          <w:rPr>
+            <w:rFonts w:ascii="Cambria Math" w:hAnsi="Cambria Math"/>
+          </w:rPr>
+          <m:t>(t)</m:t>
+        </m:r>
+      </m:oMath>
+      <w:r>
+        <w:rPr>
+          <w:rFonts w:ascii="Aptos" w:hAnsi="Aptos" w:cs="Cambria Math" w:hint="eastAsia"/>
+        </w:rPr>
+        <w:t>,</w:t>
+      </w:r>
+      <w:r>
+        <w:rPr>
+          <w:rFonts w:ascii="Aptos" w:hAnsi="Aptos" w:cs="Cambria Math"/>
+          <w:sz w:val="24"/>
+          <w:szCs w:val="24"/>
+        </w:rPr>
+        <w:t xml:space="preserve"> eligible for analysis at each delay (i.e., outbreaks long enough for an ORI to have occurred by that </w:t>
+      </w:r>
+      <w:r>
+        <w:rPr>
+          <w:rFonts w:ascii="Aptos" w:hAnsi="Aptos" w:cs="Cambria Math" w:hint="eastAsia"/>
+          <w:sz w:val="24"/>
+          <w:szCs w:val="24"/>
+        </w:rPr>
+        <w:t>week</w:t>
+      </w:r>
+      <w:r>
+        <w:rPr>
+          <w:rFonts w:ascii="Aptos" w:hAnsi="Aptos" w:cs="Cambria Math"/>
+          <w:sz w:val="24"/>
+          <w:szCs w:val="24"/>
+        </w:rPr>
+        <w:t>).</w:t>
       </w:r>
       <w:r>
         <w:rPr>
@@ -1139,7 +1315,16 @@
           <w:sz w:val="24"/>
           <w:szCs w:val="24"/>
         </w:rPr>
-        <w:t>above the X</w:t>
+        <w:t xml:space="preserve">above the </w:t>
+      </w:r>
+      <w:proofErr w:type="spellStart"/>
+      <w:r>
+        <w:rPr>
+          <w:rFonts w:ascii="Aptos" w:hAnsi="Aptos" w:cs="Cambria Math" w:hint="eastAsia"/>
+          <w:sz w:val="24"/>
+          <w:szCs w:val="24"/>
+        </w:rPr>
+        <w:t>X</w:t>
       </w:r>
       <w:r>
         <w:rPr>
@@ -1151,6 +1336,7 @@
         </w:rPr>
         <w:t>th</w:t>
       </w:r>
+      <w:proofErr w:type="spellEnd"/>
       <w:r>
         <w:rPr>
           <w:rFonts w:ascii="Aptos" w:hAnsi="Aptos" w:cs="Cambria Math" w:hint="eastAsia"/>
@@ -1200,10 +1386,10 @@
         </w:rPr>
         <w:lastRenderedPageBreak/>
         <w:drawing>
-          <wp:inline distT="0" distB="0" distL="0" distR="0" wp14:anchorId="0359BE3E" wp14:editId="5D36F9FA">
+          <wp:inline distT="0" distB="0" distL="0" distR="0" wp14:anchorId="5239A68B" wp14:editId="141561D5">
             <wp:extent cx="6000750" cy="8094345"/>
             <wp:effectExtent l="0" t="0" r="0" b="1905"/>
-            <wp:docPr id="1379585560" name="Picture 1" descr="A screenshot of a graph&#10;&#10;AI-generated content may be incorrect."/>
+            <wp:docPr id="728701736" name="Picture 1" descr="A screenshot of a graph&#10;&#10;AI-generated content may be incorrect."/>
             <wp:cNvGraphicFramePr>
               <a:graphicFrameLocks xmlns:a="http://schemas.openxmlformats.org/drawingml/2006/main" noChangeAspect="1"/>
             </wp:cNvGraphicFramePr>
@@ -1211,7 +1397,7 @@
               <a:graphicData uri="http://schemas.openxmlformats.org/drawingml/2006/picture">
                 <pic:pic xmlns:pic="http://schemas.openxmlformats.org/drawingml/2006/picture">
                   <pic:nvPicPr>
-                    <pic:cNvPr id="1379585560" name="Picture 1" descr="A screenshot of a graph&#10;&#10;AI-generated content may be incorrect."/>
+                    <pic:cNvPr id="728701736" name="Picture 1" descr="A screenshot of a graph&#10;&#10;AI-generated content may be incorrect."/>
                     <pic:cNvPicPr/>
                   </pic:nvPicPr>
                   <pic:blipFill>
@@ -1300,39 +1486,47 @@
           <w:sz w:val="24"/>
           <w:szCs w:val="24"/>
         </w:rPr>
-        <w:t xml:space="preserve">Impact of ORI implemented with </w:t>
-      </w:r>
-      <w:r>
-        <w:rPr>
-          <w:rFonts w:ascii="Aptos" w:hAnsi="Aptos" w:cs="Cambria Math"/>
-          <w:sz w:val="24"/>
-          <w:szCs w:val="24"/>
-        </w:rPr>
-        <w:t>9</w:t>
-      </w:r>
-      <w:r>
-        <w:rPr>
-          <w:rFonts w:ascii="Aptos" w:hAnsi="Aptos" w:cs="Cambria Math" w:hint="eastAsia"/>
-          <w:sz w:val="24"/>
-          <w:szCs w:val="24"/>
-        </w:rPr>
-        <w:t xml:space="preserve"> weeks of delay</w:t>
-      </w:r>
-      <w:r>
-        <w:rPr>
-          <w:rFonts w:ascii="Aptos" w:hAnsi="Aptos" w:cs="Cambria Math"/>
-          <w:sz w:val="24"/>
-          <w:szCs w:val="24"/>
-        </w:rPr>
-        <w:t xml:space="preserve"> under 75% coverage for subsets of outbreaks. </w:t>
-      </w:r>
-      <w:r>
-        <w:rPr>
-          <w:rFonts w:ascii="Aptos" w:hAnsi="Aptos" w:cs="Cambria Math" w:hint="eastAsia"/>
-          <w:sz w:val="24"/>
-          <w:szCs w:val="24"/>
-        </w:rPr>
-        <w:t>(A) The number of outbreaks targeted against the number of OCV doses deployed. The red dashed lines indicate the number of OCV doses deployed for reactive vaccination up to 2020 (maximum year in our dataset) and 2024. (B) The number of cases averted. (C) The number of cases averted per 1,000 OCVs. (D) DALY (disability-adjusted life year) averted per 1,000 OCVs. (E)</w:t>
+        <w:t>Impact</w:t>
+      </w:r>
+      <w:r>
+        <w:rPr>
+          <w:rFonts w:ascii="Aptos" w:hAnsi="Aptos" w:cs="Cambria Math" w:hint="eastAsia"/>
+          <w:sz w:val="24"/>
+          <w:szCs w:val="24"/>
+        </w:rPr>
+        <w:t>, efficiency, and cost effectiveness</w:t>
+      </w:r>
+      <w:r>
+        <w:rPr>
+          <w:rFonts w:ascii="Aptos" w:hAnsi="Aptos" w:cs="Cambria Math" w:hint="eastAsia"/>
+          <w:sz w:val="24"/>
+          <w:szCs w:val="24"/>
+        </w:rPr>
+        <w:t xml:space="preserve"> of ORI</w:t>
+      </w:r>
+      <w:r>
+        <w:rPr>
+          <w:rFonts w:ascii="Aptos" w:hAnsi="Aptos" w:cs="Cambria Math" w:hint="eastAsia"/>
+          <w:sz w:val="24"/>
+          <w:szCs w:val="24"/>
+        </w:rPr>
+        <w:t xml:space="preserve">s </w:t>
+      </w:r>
+      <w:r>
+        <w:rPr>
+          <w:rFonts w:ascii="Aptos" w:hAnsi="Aptos" w:cs="Cambria Math"/>
+          <w:sz w:val="24"/>
+          <w:szCs w:val="24"/>
+        </w:rPr>
+        <w:t xml:space="preserve">under 75% coverage for subsets of outbreaks. </w:t>
+      </w:r>
+      <w:r>
+        <w:rPr>
+          <w:rFonts w:ascii="Aptos" w:hAnsi="Aptos" w:cs="Cambria Math" w:hint="eastAsia"/>
+          <w:sz w:val="24"/>
+          <w:szCs w:val="24"/>
+        </w:rPr>
+        <w:t>(A) The number of outbreaks targeted against the number of OCV doses deployed. The red dashed lines indicate the number of OCV doses deployed for reactive vaccination up to 2020 (maximum year in our dataset) and 2024. (B) The number of cases averted. (C) The number of cases averted per 1,000 OCVs. (D) DALY averted per 1,000 OCVs. (E)</w:t>
       </w:r>
       <w:r>
         <w:rPr>
@@ -1356,7 +1550,71 @@
           <w:sz w:val="24"/>
           <w:szCs w:val="24"/>
         </w:rPr>
-        <w:t xml:space="preserve">Empty circles and filled upward triangles represent median values across 200 samples of outbreaks for ORIs implemented with the delay of 9 weeks and 1 week, respectively. Error bars show interquartile ranges for the impact from ORIs with the delay of 9 weeks. </w:t>
+        <w:t xml:space="preserve">Empty circles and filled upward triangles represent median values across 200 samples of outbreaks for ORIs implemented </w:t>
+      </w:r>
+      <w:r>
+        <w:rPr>
+          <w:rFonts w:ascii="Aptos" w:hAnsi="Aptos" w:cs="Cambria Math" w:hint="eastAsia"/>
+          <w:sz w:val="24"/>
+          <w:szCs w:val="24"/>
+        </w:rPr>
+        <w:t xml:space="preserve">in </w:t>
+      </w:r>
+      <w:r>
+        <w:rPr>
+          <w:rFonts w:ascii="Aptos" w:hAnsi="Aptos" w:cs="Cambria Math" w:hint="eastAsia"/>
+          <w:sz w:val="24"/>
+          <w:szCs w:val="24"/>
+        </w:rPr>
+        <w:t>week</w:t>
+      </w:r>
+      <w:r>
+        <w:rPr>
+          <w:rFonts w:ascii="Aptos" w:hAnsi="Aptos" w:cs="Cambria Math" w:hint="eastAsia"/>
+          <w:sz w:val="24"/>
+          <w:szCs w:val="24"/>
+        </w:rPr>
+        <w:t xml:space="preserve"> 1 and week 9</w:t>
+      </w:r>
+      <w:r>
+        <w:rPr>
+          <w:rFonts w:ascii="Aptos" w:hAnsi="Aptos" w:cs="Cambria Math" w:hint="eastAsia"/>
+          <w:sz w:val="24"/>
+          <w:szCs w:val="24"/>
+        </w:rPr>
+        <w:t xml:space="preserve">, respectively. Error bars show interquartile ranges for the </w:t>
+      </w:r>
+      <w:r>
+        <w:rPr>
+          <w:rFonts w:ascii="Aptos" w:hAnsi="Aptos" w:cs="Cambria Math" w:hint="eastAsia"/>
+          <w:sz w:val="24"/>
+          <w:szCs w:val="24"/>
+        </w:rPr>
+        <w:t>outcomes</w:t>
+      </w:r>
+      <w:r>
+        <w:rPr>
+          <w:rFonts w:ascii="Aptos" w:hAnsi="Aptos" w:cs="Cambria Math" w:hint="eastAsia"/>
+          <w:sz w:val="24"/>
+          <w:szCs w:val="24"/>
+        </w:rPr>
+        <w:t xml:space="preserve"> from ORIs </w:t>
+      </w:r>
+      <w:r>
+        <w:rPr>
+          <w:rFonts w:ascii="Aptos" w:hAnsi="Aptos" w:cs="Cambria Math" w:hint="eastAsia"/>
+          <w:sz w:val="24"/>
+          <w:szCs w:val="24"/>
+        </w:rPr>
+        <w:t>implemented in week</w:t>
+      </w:r>
+      <w:r>
+        <w:rPr>
+          <w:rFonts w:ascii="Aptos" w:hAnsi="Aptos" w:cs="Cambria Math" w:hint="eastAsia"/>
+          <w:sz w:val="24"/>
+          <w:szCs w:val="24"/>
+        </w:rPr>
+        <w:t xml:space="preserve"> 9. </w:t>
       </w:r>
       <w:r>
         <w:rPr>
@@ -1424,8 +1682,27 @@
           <w:sz w:val="24"/>
           <w:szCs w:val="24"/>
         </w:rPr>
-        <w:t xml:space="preserve">, denote subsets containing outbreaks at or above the </w:t>
-      </w:r>
+        <w:t xml:space="preserve">, </w:t>
+      </w:r>
+      <w:proofErr w:type="gramStart"/>
+      <w:r>
+        <w:rPr>
+          <w:rFonts w:ascii="Aptos" w:hAnsi="Aptos" w:cs="Cambria Math"/>
+          <w:sz w:val="24"/>
+          <w:szCs w:val="24"/>
+        </w:rPr>
+        <w:t>denote</w:t>
+      </w:r>
+      <w:proofErr w:type="gramEnd"/>
+      <w:r>
+        <w:rPr>
+          <w:rFonts w:ascii="Aptos" w:hAnsi="Aptos" w:cs="Cambria Math"/>
+          <w:sz w:val="24"/>
+          <w:szCs w:val="24"/>
+        </w:rPr>
+        <w:t xml:space="preserve"> subsets containing outbreaks at or above the </w:t>
+      </w:r>
+      <w:proofErr w:type="spellStart"/>
       <w:r>
         <w:rPr>
           <w:rFonts w:ascii="Aptos" w:hAnsi="Aptos" w:cs="Cambria Math" w:hint="eastAsia"/>
@@ -1442,7 +1719,16 @@
           <w:sz w:val="24"/>
           <w:szCs w:val="24"/>
         </w:rPr>
-        <w:t xml:space="preserve">th percentile of the </w:t>
+        <w:t>th</w:t>
+      </w:r>
+      <w:proofErr w:type="spellEnd"/>
+      <w:r>
+        <w:rPr>
+          <w:rFonts w:ascii="Aptos" w:hAnsi="Aptos" w:cs="Cambria Math"/>
+          <w:sz w:val="24"/>
+          <w:szCs w:val="24"/>
+        </w:rPr>
+        <w:t xml:space="preserve"> percentile of the </w:t>
       </w:r>
       <w:r>
         <w:rPr>
@@ -1495,10 +1781,10 @@
         </w:rPr>
         <w:lastRenderedPageBreak/>
         <w:drawing>
-          <wp:inline distT="0" distB="0" distL="0" distR="0" wp14:anchorId="495E43B2" wp14:editId="7BD7BF0E">
+          <wp:inline distT="0" distB="0" distL="0" distR="0" wp14:anchorId="55AF7A35" wp14:editId="4BA5E700">
             <wp:extent cx="6000750" cy="8094345"/>
             <wp:effectExtent l="0" t="0" r="0" b="1905"/>
-            <wp:docPr id="153861222" name="Picture 1" descr="A collage of graphs&#10;&#10;AI-generated content may be incorrect."/>
+            <wp:docPr id="566079283" name="Picture 1" descr="A graph of different colored lines&#10;&#10;AI-generated content may be incorrect."/>
             <wp:cNvGraphicFramePr>
               <a:graphicFrameLocks xmlns:a="http://schemas.openxmlformats.org/drawingml/2006/main" noChangeAspect="1"/>
             </wp:cNvGraphicFramePr>
@@ -1506,7 +1792,7 @@
               <a:graphicData uri="http://schemas.openxmlformats.org/drawingml/2006/picture">
                 <pic:pic xmlns:pic="http://schemas.openxmlformats.org/drawingml/2006/picture">
                   <pic:nvPicPr>
-                    <pic:cNvPr id="153861222" name="Picture 1" descr="A collage of graphs&#10;&#10;AI-generated content may be incorrect."/>
+                    <pic:cNvPr id="566079283" name="Picture 1" descr="A graph of different colored lines&#10;&#10;AI-generated content may be incorrect."/>
                     <pic:cNvPicPr/>
                   </pic:nvPicPr>
                   <pic:blipFill>

</xml_diff>

<commit_message>
table 3 top 10%
</commit_message>
<xml_diff>
--- a/papers/Figures_31Oct2025.docx
+++ b/papers/Figures_31Oct2025.docx
@@ -102,33 +102,31 @@
           <w:sz w:val="24"/>
           <w:szCs w:val="24"/>
         </w:rPr>
-        <w:t>can be triggered either by elapsed time since outbreak onset or by reaching a cumulative case threshold (red thick line).</w:t>
-      </w:r>
-      <w:r>
-        <w:rPr>
-          <w:rFonts w:ascii="Aptos" w:hAnsi="Aptos" w:cs="Cambria Math" w:hint="eastAsia"/>
-          <w:sz w:val="24"/>
-          <w:szCs w:val="24"/>
-        </w:rPr>
-        <w:t xml:space="preserve"> Vaccination then occurs after a random delay (thick green line</w:t>
-      </w:r>
-      <w:proofErr w:type="gramStart"/>
-      <w:r>
-        <w:rPr>
-          <w:rFonts w:ascii="Aptos" w:hAnsi="Aptos" w:cs="Cambria Math" w:hint="eastAsia"/>
-          <w:sz w:val="24"/>
-          <w:szCs w:val="24"/>
-        </w:rPr>
-        <w:t>)</w:t>
-      </w:r>
-      <w:proofErr w:type="gramEnd"/>
-      <w:r>
-        <w:rPr>
-          <w:rFonts w:ascii="Aptos" w:hAnsi="Aptos" w:cs="Cambria Math" w:hint="eastAsia"/>
-          <w:sz w:val="24"/>
-          <w:szCs w:val="24"/>
-        </w:rPr>
-        <w:t xml:space="preserve"> and v</w:t>
+        <w:t xml:space="preserve">can be triggered </w:t>
+      </w:r>
+      <w:r>
+        <w:rPr>
+          <w:rFonts w:ascii="Aptos" w:hAnsi="Aptos" w:cs="Cambria Math" w:hint="eastAsia"/>
+          <w:sz w:val="24"/>
+          <w:szCs w:val="24"/>
+        </w:rPr>
+        <w:t>either at outbreak onset</w:t>
+      </w:r>
+      <w:r>
+        <w:rPr>
+          <w:rFonts w:ascii="Aptos" w:hAnsi="Aptos" w:cs="Cambria Math"/>
+          <w:sz w:val="24"/>
+          <w:szCs w:val="24"/>
+        </w:rPr>
+        <w:t xml:space="preserve"> or by reaching a cumulative case threshold (red thick line).</w:t>
+      </w:r>
+      <w:r>
+        <w:rPr>
+          <w:rFonts w:ascii="Aptos" w:hAnsi="Aptos" w:cs="Cambria Math" w:hint="eastAsia"/>
+          <w:sz w:val="24"/>
+          <w:szCs w:val="24"/>
+        </w:rPr>
+        <w:t xml:space="preserve"> Vaccination then occurs after a random delay (thick green line) and v</w:t>
       </w:r>
       <w:r>
         <w:rPr>
@@ -160,7 +158,15 @@
           <w:sz w:val="24"/>
           <w:szCs w:val="24"/>
         </w:rPr>
-        <w:t xml:space="preserve"> post-v</w:t>
+        <w:t xml:space="preserve"> </w:t>
+      </w:r>
+      <w:r>
+        <w:rPr>
+          <w:rFonts w:ascii="Aptos" w:hAnsi="Aptos" w:cs="Cambria Math" w:hint="eastAsia"/>
+          <w:sz w:val="24"/>
+          <w:szCs w:val="24"/>
+        </w:rPr>
+        <w:t>following v</w:t>
       </w:r>
       <w:r>
         <w:rPr>
@@ -642,25 +648,7 @@
           <w:sz w:val="24"/>
           <w:szCs w:val="24"/>
         </w:rPr>
-        <w:t xml:space="preserve">(C) Median epidemic curve with 95% central percentiles; </w:t>
-      </w:r>
-      <w:proofErr w:type="gramStart"/>
-      <w:r>
-        <w:rPr>
-          <w:rFonts w:ascii="Aptos" w:hAnsi="Aptos" w:cs="Cambria Math"/>
-          <w:sz w:val="24"/>
-          <w:szCs w:val="24"/>
-        </w:rPr>
-        <w:t>inset</w:t>
-      </w:r>
-      <w:proofErr w:type="gramEnd"/>
-      <w:r>
-        <w:rPr>
-          <w:rFonts w:ascii="Aptos" w:hAnsi="Aptos" w:cs="Cambria Math"/>
-          <w:sz w:val="24"/>
-          <w:szCs w:val="24"/>
-        </w:rPr>
-        <w:t xml:space="preserve"> shows the cumulative probability distribution of time to peak (in weeks).</w:t>
+        <w:t>(C) Median epidemic curve with 95% central percentiles; inset shows the cumulative probability distribution of time to peak (in weeks).</w:t>
       </w:r>
       <w:r>
         <w:rPr>
@@ -1122,7 +1110,7 @@
           <w:sz w:val="24"/>
           <w:szCs w:val="24"/>
         </w:rPr>
-        <w:t xml:space="preserve"> eligible for analysis at each delay (i.e., outbreaks long enough for an ORI to have occurred by that </w:t>
+        <w:t xml:space="preserve"> eligible for analysis at each </w:t>
       </w:r>
       <w:r>
         <w:rPr>
@@ -1138,6 +1126,22 @@
           <w:sz w:val="24"/>
           <w:szCs w:val="24"/>
         </w:rPr>
+        <w:t xml:space="preserve"> (i.e., outbreaks long enough for an ORI to have occurred by that </w:t>
+      </w:r>
+      <w:r>
+        <w:rPr>
+          <w:rFonts w:ascii="Aptos" w:hAnsi="Aptos" w:cs="Cambria Math" w:hint="eastAsia"/>
+          <w:sz w:val="24"/>
+          <w:szCs w:val="24"/>
+        </w:rPr>
+        <w:t>week</w:t>
+      </w:r>
+      <w:r>
+        <w:rPr>
+          <w:rFonts w:ascii="Aptos" w:hAnsi="Aptos" w:cs="Cambria Math"/>
+          <w:sz w:val="24"/>
+          <w:szCs w:val="24"/>
+        </w:rPr>
         <w:t>).</w:t>
       </w:r>
       <w:r>
@@ -1315,16 +1319,7 @@
           <w:sz w:val="24"/>
           <w:szCs w:val="24"/>
         </w:rPr>
-        <w:t xml:space="preserve">above the </w:t>
-      </w:r>
-      <w:proofErr w:type="spellStart"/>
-      <w:r>
-        <w:rPr>
-          <w:rFonts w:ascii="Aptos" w:hAnsi="Aptos" w:cs="Cambria Math" w:hint="eastAsia"/>
-          <w:sz w:val="24"/>
-          <w:szCs w:val="24"/>
-        </w:rPr>
-        <w:t>X</w:t>
+        <w:t>above the X</w:t>
       </w:r>
       <w:r>
         <w:rPr>
@@ -1336,7 +1331,6 @@
         </w:rPr>
         <w:t>th</w:t>
       </w:r>
-      <w:proofErr w:type="spellEnd"/>
       <w:r>
         <w:rPr>
           <w:rFonts w:ascii="Aptos" w:hAnsi="Aptos" w:cs="Cambria Math" w:hint="eastAsia"/>
@@ -1666,7 +1660,7 @@
           <w:sz w:val="24"/>
           <w:szCs w:val="24"/>
         </w:rPr>
-        <w:t>z</w:t>
+        <w:t>x</w:t>
       </w:r>
       <w:r>
         <w:rPr>
@@ -1682,27 +1676,8 @@
           <w:sz w:val="24"/>
           <w:szCs w:val="24"/>
         </w:rPr>
-        <w:t xml:space="preserve">, </w:t>
-      </w:r>
-      <w:proofErr w:type="gramStart"/>
-      <w:r>
-        <w:rPr>
-          <w:rFonts w:ascii="Aptos" w:hAnsi="Aptos" w:cs="Cambria Math"/>
-          <w:sz w:val="24"/>
-          <w:szCs w:val="24"/>
-        </w:rPr>
-        <w:t>denote</w:t>
-      </w:r>
-      <w:proofErr w:type="gramEnd"/>
-      <w:r>
-        <w:rPr>
-          <w:rFonts w:ascii="Aptos" w:hAnsi="Aptos" w:cs="Cambria Math"/>
-          <w:sz w:val="24"/>
-          <w:szCs w:val="24"/>
-        </w:rPr>
-        <w:t xml:space="preserve"> subsets containing outbreaks at or above the </w:t>
-      </w:r>
-      <w:proofErr w:type="spellStart"/>
+        <w:t xml:space="preserve">, denote subsets containing outbreaks at or above the </w:t>
+      </w:r>
       <w:r>
         <w:rPr>
           <w:rFonts w:ascii="Aptos" w:hAnsi="Aptos" w:cs="Cambria Math" w:hint="eastAsia"/>
@@ -1719,16 +1694,7 @@
           <w:sz w:val="24"/>
           <w:szCs w:val="24"/>
         </w:rPr>
-        <w:t>th</w:t>
-      </w:r>
-      <w:proofErr w:type="spellEnd"/>
-      <w:r>
-        <w:rPr>
-          <w:rFonts w:ascii="Aptos" w:hAnsi="Aptos" w:cs="Cambria Math"/>
-          <w:sz w:val="24"/>
-          <w:szCs w:val="24"/>
-        </w:rPr>
-        <w:t xml:space="preserve"> percentile of the </w:t>
+        <w:t xml:space="preserve">th percentile of the </w:t>
       </w:r>
       <w:r>
         <w:rPr>
@@ -1746,7 +1712,7 @@
           <w:sz w:val="24"/>
           <w:szCs w:val="24"/>
         </w:rPr>
-        <w:t>z</w:t>
+        <w:t>x</w:t>
       </w:r>
       <w:r>
         <w:rPr>
@@ -1816,53 +1782,7 @@
           </wp:inline>
         </w:drawing>
       </w:r>
-    </w:p>
-    <w:p>
-      <w:pPr>
-        <w:rPr>
-          <w:rFonts w:ascii="Aptos" w:hAnsi="Aptos" w:cs="Cambria Math"/>
-          <w:sz w:val="24"/>
-          <w:szCs w:val="24"/>
-        </w:rPr>
-      </w:pPr>
-    </w:p>
-    <w:p>
-      <w:pPr>
-        <w:rPr>
-          <w:rFonts w:ascii="Aptos" w:hAnsi="Aptos" w:cs="Cambria Math"/>
-          <w:sz w:val="24"/>
-          <w:szCs w:val="24"/>
-        </w:rPr>
-      </w:pPr>
-      <w:r>
-        <w:rPr>
-          <w:rFonts w:ascii="Aptos" w:hAnsi="Aptos" w:cs="Cambria Math" w:hint="eastAsia"/>
-          <w:sz w:val="24"/>
-          <w:szCs w:val="24"/>
-        </w:rPr>
-        <w:t xml:space="preserve"> </w:t>
-      </w:r>
-    </w:p>
-    <w:p>
-      <w:pPr>
-        <w:jc w:val="center"/>
-        <w:rPr>
-          <w:rFonts w:ascii="Aptos" w:hAnsi="Aptos" w:cs="Cambria Math"/>
-          <w:sz w:val="24"/>
-          <w:szCs w:val="24"/>
-        </w:rPr>
-      </w:pPr>
-    </w:p>
-    <w:bookmarkEnd w:id="1"/>
-    <w:p>
-      <w:pPr>
-        <w:jc w:val="center"/>
-        <w:rPr>
-          <w:rFonts w:ascii="Aptos" w:hAnsi="Aptos" w:cs="Cambria Math"/>
-          <w:sz w:val="24"/>
-          <w:szCs w:val="24"/>
-        </w:rPr>
-      </w:pPr>
+      <w:bookmarkEnd w:id="1"/>
     </w:p>
     <w:sectPr>
       <w:pgSz w:w="12240" w:h="15840"/>

</xml_diff>